<commit_message>
Add Sync Tactiq button, /open URL support, and scheduled sync wiring
- app.py: /open route now handles https:// URLs via webbrowser.open
- app.py: add sync-tactiq to _SCRIPTS panel
- index.html: add Sync Tactiq button
- app.js: include btn-sync-tactiq in button disable list
- OPERATIONS_MANUAL.md, Project_Roster.docx: updated

Co-Authored-By: Claude Sonnet 4.6 <noreply@anthropic.com>
</commit_message>
<xml_diff>
--- a/Project_Roster.docx
+++ b/Project_Roster.docx
@@ -1,5 +1,27 @@
 
-<file path=word/document.xml><?xml version="1.0" encoding="utf-8"?>
+<file path=docProps\app.xml><?xml version="1.0" encoding="utf-8"?>
+<Properties xmlns="http://schemas.openxmlformats.org/officeDocument/2006/extended-properties" xmlns:vt="http://schemas.openxmlformats.org/officeDocument/2006/docPropsVTypes"/>
+</file>
+
+<file path=docProps\core.xml><?xml version="1.0" encoding="utf-8"?>
+<cp:coreProperties xmlns:cp="http://schemas.openxmlformats.org/package/2006/metadata/core-properties" xmlns:dc="http://purl.org/dc/elements/1.1/" xmlns:dcterms="http://purl.org/dc/terms/" xmlns:dcmitype="http://purl.org/dc/dcmitype/" xmlns:xsi="http://www.w3.org/2001/XMLSchema-instance">
+  <dc:creator>Un-named</dc:creator>
+  <cp:lastModifiedBy>Un-named</cp:lastModifiedBy>
+  <cp:revision>1</cp:revision>
+  <dcterms:created xsi:type="dcterms:W3CDTF">2026-06-25T21:59:58.175Z</dcterms:created>
+  <dcterms:modified xsi:type="dcterms:W3CDTF">2026-06-25T21:59:58.175Z</dcterms:modified>
+</cp:coreProperties>
+</file>
+
+<file path=docProps\custom.xml><?xml version="1.0" encoding="utf-8"?>
+<Properties xmlns="http://schemas.openxmlformats.org/officeDocument/2006/custom-properties" xmlns:vt="http://schemas.openxmlformats.org/officeDocument/2006/docPropsVTypes"/>
+</file>
+
+<file path=word\comments.xml><?xml version="1.0" encoding="utf-8"?>
+<w:comments xmlns:cx="http://schemas.microsoft.com/office/drawing/2014/chartex" xmlns:cx1="http://schemas.microsoft.com/office/drawing/2015/9/8/chartex" xmlns:cx2="http://schemas.microsoft.com/office/drawing/2015/10/21/chartex" xmlns:cx3="http://schemas.microsoft.com/office/drawing/2016/5/9/chartex" xmlns:cx4="http://schemas.microsoft.com/office/drawing/2016/5/10/chartex" xmlns:cx5="http://schemas.microsoft.com/office/drawing/2016/5/11/chartex" xmlns:cx6="http://schemas.microsoft.com/office/drawing/2016/5/12/chartex" xmlns:cx7="http://schemas.microsoft.com/office/drawing/2016/5/13/chartex" xmlns:cx8="http://schemas.microsoft.com/office/drawing/2016/5/14/chartex" xmlns:mc="http://schemas.openxmlformats.org/markup-compatibility/2006" xmlns:aink="http://schemas.microsoft.com/office/drawing/2016/ink" xmlns:am3d="http://schemas.microsoft.com/office/drawing/2017/model3d" xmlns:o="urn:schemas-microsoft-com:office:office" xmlns:r="http://schemas.openxmlformats.org/officeDocument/2006/relationships" xmlns:m="http://schemas.openxmlformats.org/officeDocument/2006/math" xmlns:v="urn:schemas-microsoft-com:vml" xmlns:wp14="http://schemas.microsoft.com/office/word/2010/wordprocessingDrawing" xmlns:wp="http://schemas.openxmlformats.org/drawingml/2006/wordprocessingDrawing" xmlns:w10="urn:schemas-microsoft-com:office:word" xmlns:w="http://schemas.openxmlformats.org/wordprocessingml/2006/main" xmlns:w14="http://schemas.microsoft.com/office/word/2010/wordml" xmlns:w15="http://schemas.microsoft.com/office/word/2012/wordml" xmlns:w16cex="http://schemas.microsoft.com/office/word/2018/wordml/cex" xmlns:w16cid="http://schemas.microsoft.com/office/word/2016/wordml/cid" xmlns:w16="http://schemas.microsoft.com/office/word/2018/wordml" xmlns:w16sdtdh="http://schemas.microsoft.com/office/word/2020/wordml/sdtdatahash" xmlns:w16se="http://schemas.microsoft.com/office/word/2015/wordml/symex" xmlns:wpg="http://schemas.microsoft.com/office/word/2010/wordprocessingGroup" xmlns:wpi="http://schemas.microsoft.com/office/word/2010/wordprocessingInk" xmlns:wne="http://schemas.microsoft.com/office/word/2006/wordml" xmlns:wps="http://schemas.microsoft.com/office/word/2010/wordprocessingShape"/>
+</file>
+
+<file path=word\document.xml><?xml version="1.0" encoding="utf-8"?>
 <w:document xmlns:wpc="http://schemas.microsoft.com/office/word/2010/wordprocessingCanvas" xmlns:mc="http://schemas.openxmlformats.org/markup-compatibility/2006" xmlns:o="urn:schemas-microsoft-com:office:office" xmlns:r="http://schemas.openxmlformats.org/officeDocument/2006/relationships" xmlns:m="http://schemas.openxmlformats.org/officeDocument/2006/math" xmlns:v="urn:schemas-microsoft-com:vml" xmlns:wp14="http://schemas.microsoft.com/office/word/2010/wordprocessingDrawing" xmlns:wp="http://schemas.openxmlformats.org/drawingml/2006/wordprocessingDrawing" xmlns:w10="urn:schemas-microsoft-com:office:word" xmlns:w="http://schemas.openxmlformats.org/wordprocessingml/2006/main" xmlns:w14="http://schemas.microsoft.com/office/word/2010/wordml" xmlns:w15="http://schemas.microsoft.com/office/word/2012/wordml" xmlns:wpg="http://schemas.microsoft.com/office/word/2010/wordprocessingGroup" xmlns:wpi="http://schemas.microsoft.com/office/word/2010/wordprocessingInk" xmlns:wne="http://schemas.microsoft.com/office/word/2006/wordml" xmlns:wps="http://schemas.microsoft.com/office/word/2010/wordprocessingShape" xmlns:cx="http://schemas.microsoft.com/office/drawing/2014/chartex" xmlns:cx1="http://schemas.microsoft.com/office/drawing/2015/9/8/chartex" xmlns:cx2="http://schemas.microsoft.com/office/drawing/2015/10/21/chartex" xmlns:cx3="http://schemas.microsoft.com/office/drawing/2016/5/9/chartex" xmlns:cx4="http://schemas.microsoft.com/office/drawing/2016/5/10/chartex" xmlns:cx5="http://schemas.microsoft.com/office/drawing/2016/5/11/chartex" xmlns:cx6="http://schemas.microsoft.com/office/drawing/2016/5/12/chartex" xmlns:cx7="http://schemas.microsoft.com/office/drawing/2016/5/13/chartex" xmlns:cx8="http://schemas.microsoft.com/office/drawing/2016/5/14/chartex" xmlns:aink="http://schemas.microsoft.com/office/drawing/2016/ink" xmlns:am3d="http://schemas.microsoft.com/office/drawing/2017/model3d" xmlns:w16cex="http://schemas.microsoft.com/office/word/2018/wordml/cex" xmlns:w16cid="http://schemas.microsoft.com/office/word/2016/wordml/cid" xmlns:w16="http://schemas.microsoft.com/office/word/2018/wordml" xmlns:w16sdtdh="http://schemas.microsoft.com/office/word/2020/wordml/sdtdatahash" xmlns:w16se="http://schemas.microsoft.com/office/word/2015/wordml/symex" mc:Ignorable="w14 w15 wp14">
   <w:body>
     <w:p>
@@ -212,39 +234,7 @@
           <w:sz w:val="20"/>
           <w:szCs w:val="20"/>
         </w:rPr>
-        <w:t xml:space="preserve">Navy/Blue = Paramount internal  |  </w:t>
-      </w:r>
-      <w:r>
-        <w:rPr>
-          <w:rFonts w:ascii="Arial" w:cs="Arial" w:eastAsia="Arial" w:hAnsi="Arial"/>
-          <w:sz w:val="20"/>
-          <w:szCs w:val="20"/>
-        </w:rPr>
-        <w:t xml:space="preserve">Green = Max/MACCS  |  </w:t>
-      </w:r>
-      <w:r>
-        <w:rPr>
-          <w:rFonts w:ascii="Arial" w:cs="Arial" w:eastAsia="Arial" w:hAnsi="Arial"/>
-          <w:sz w:val="20"/>
-          <w:szCs w:val="20"/>
-        </w:rPr>
-        <w:t xml:space="preserve">Orange = EAI/Integration  |  </w:t>
-      </w:r>
-      <w:r>
-        <w:rPr>
-          <w:rFonts w:ascii="Arial" w:cs="Arial" w:eastAsia="Arial" w:hAnsi="Arial"/>
-          <w:sz w:val="20"/>
-          <w:szCs w:val="20"/>
-        </w:rPr>
-        <w:t xml:space="preserve">Purple = OCS/Oracle  |  </w:t>
-      </w:r>
-      <w:r>
-        <w:rPr>
-          <w:rFonts w:ascii="Arial" w:cs="Arial" w:eastAsia="Arial" w:hAnsi="Arial"/>
-          <w:sz w:val="20"/>
-          <w:szCs w:val="20"/>
-        </w:rPr>
-        <w:t xml:space="preserve">Yellow = Boundary System owners</w:t>
+        <w:t>Navy/Blue = Paramount internal  |  Green = Max/MACCS  |  Orange = EAI/Integration  |  Purple = OCS/Oracle  |  Yellow = Boundary System owners</w:t>
       </w:r>
     </w:p>
     <w:p>
@@ -1411,6 +1401,282 @@
                 <w:szCs w:val="20"/>
               </w:rPr>
               <w:t xml:space="preserve">Accounting support. Involved in COA and GL account decisions. NOTE: surname is Bown, not Brown. Email: Tony_Bown@Paramount.com</w:t>
+            </w:r>
+          </w:p>
+        </w:tc>
+      </w:tr>
+      <w:tr>
+        <w:tc>
+          <w:tcPr>
+            <w:tcW w:type="dxa" w:w="1800"/>
+            <w:tcBorders>
+              <w:top w:val="single" w:color="BFBFBF" w:sz="4"/>
+              <w:left w:val="single" w:color="BFBFBF" w:sz="4"/>
+              <w:bottom w:val="single" w:color="BFBFBF" w:sz="4"/>
+              <w:right w:val="single" w:color="BFBFBF" w:sz="4"/>
+            </w:tcBorders>
+            <w:tcMar>
+              <w:top w:type="dxa" w:w="80"/>
+              <w:left w:type="dxa" w:w="120"/>
+              <w:bottom w:type="dxa" w:w="80"/>
+              <w:right w:type="dxa" w:w="120"/>
+            </w:tcMar>
+          </w:tcPr>
+          <w:p>
+            <w:r>
+              <w:rPr>
+                <w:rFonts w:ascii="Arial" w:cs="Arial" w:eastAsia="Arial" w:hAnsi="Arial"/>
+                <w:b w:val="false"/>
+                <w:bCs w:val="false"/>
+                <w:color w:val="000000"/>
+                <w:sz w:val="20"/>
+                <w:szCs w:val="20"/>
+              </w:rPr>
+              <w:t xml:space="preserve">Corey Barberie</w:t>
+            </w:r>
+          </w:p>
+        </w:tc>
+        <w:tc>
+          <w:tcPr>
+            <w:tcW w:type="dxa" w:w="3200"/>
+            <w:tcBorders>
+              <w:top w:val="single" w:color="BFBFBF" w:sz="4"/>
+              <w:left w:val="single" w:color="BFBFBF" w:sz="4"/>
+              <w:bottom w:val="single" w:color="BFBFBF" w:sz="4"/>
+              <w:right w:val="single" w:color="BFBFBF" w:sz="4"/>
+            </w:tcBorders>
+            <w:tcMar>
+              <w:top w:type="dxa" w:w="80"/>
+              <w:left w:type="dxa" w:w="120"/>
+              <w:bottom w:type="dxa" w:w="80"/>
+              <w:right w:type="dxa" w:w="120"/>
+            </w:tcMar>
+          </w:tcPr>
+          <w:p>
+            <w:r>
+              <w:rPr>
+                <w:rFonts w:ascii="Arial" w:cs="Arial" w:eastAsia="Arial" w:hAnsi="Arial"/>
+                <w:b w:val="false"/>
+                <w:bCs w:val="false"/>
+                <w:color w:val="000000"/>
+                <w:sz w:val="20"/>
+                <w:szCs w:val="20"/>
+              </w:rPr>
+              <w:t xml:space="preserve">Paramount — VP Accounting</w:t>
+            </w:r>
+          </w:p>
+        </w:tc>
+        <w:tc>
+          <w:tcPr>
+            <w:tcW w:type="dxa" w:w="4360"/>
+            <w:tcBorders>
+              <w:top w:val="single" w:color="BFBFBF" w:sz="4"/>
+              <w:left w:val="single" w:color="BFBFBF" w:sz="4"/>
+              <w:bottom w:val="single" w:color="BFBFBF" w:sz="4"/>
+              <w:right w:val="single" w:color="BFBFBF" w:sz="4"/>
+            </w:tcBorders>
+            <w:tcMar>
+              <w:top w:type="dxa" w:w="80"/>
+              <w:left w:type="dxa" w:w="120"/>
+              <w:bottom w:type="dxa" w:w="80"/>
+              <w:right w:type="dxa" w:w="120"/>
+            </w:tcMar>
+          </w:tcPr>
+          <w:p>
+            <w:r>
+              <w:rPr>
+                <w:rFonts w:ascii="Arial" w:cs="Arial" w:eastAsia="Arial" w:hAnsi="Arial"/>
+                <w:b w:val="false"/>
+                <w:bCs w:val="false"/>
+                <w:color w:val="000000"/>
+                <w:sz w:val="20"/>
+                <w:szCs w:val="20"/>
+              </w:rPr>
+              <w:t xml:space="preserve">VP Accounting at Paramount. Senior finance leader in the Controllership/Finance org. Email: Corey_Barberie@Paramount.com</w:t>
+            </w:r>
+          </w:p>
+        </w:tc>
+      </w:tr>
+      <w:tr>
+        <w:tc>
+          <w:tcPr>
+            <w:tcW w:type="dxa" w:w="1800"/>
+            <w:tcBorders>
+              <w:top w:val="single" w:color="BFBFBF" w:sz="4"/>
+              <w:left w:val="single" w:color="BFBFBF" w:sz="4"/>
+              <w:bottom w:val="single" w:color="BFBFBF" w:sz="4"/>
+              <w:right w:val="single" w:color="BFBFBF" w:sz="4"/>
+            </w:tcBorders>
+            <w:tcMar>
+              <w:top w:type="dxa" w:w="80"/>
+              <w:left w:type="dxa" w:w="120"/>
+              <w:bottom w:type="dxa" w:w="80"/>
+              <w:right w:type="dxa" w:w="120"/>
+            </w:tcMar>
+          </w:tcPr>
+          <w:p>
+            <w:r>
+              <w:rPr>
+                <w:rFonts w:ascii="Arial" w:cs="Arial" w:eastAsia="Arial" w:hAnsi="Arial"/>
+                <w:b w:val="false"/>
+                <w:bCs w:val="false"/>
+                <w:color w:val="000000"/>
+                <w:sz w:val="20"/>
+                <w:szCs w:val="20"/>
+              </w:rPr>
+              <w:t xml:space="preserve">Lena Malkon</w:t>
+            </w:r>
+          </w:p>
+        </w:tc>
+        <w:tc>
+          <w:tcPr>
+            <w:tcW w:type="dxa" w:w="3200"/>
+            <w:tcBorders>
+              <w:top w:val="single" w:color="BFBFBF" w:sz="4"/>
+              <w:left w:val="single" w:color="BFBFBF" w:sz="4"/>
+              <w:bottom w:val="single" w:color="BFBFBF" w:sz="4"/>
+              <w:right w:val="single" w:color="BFBFBF" w:sz="4"/>
+            </w:tcBorders>
+            <w:tcMar>
+              <w:top w:type="dxa" w:w="80"/>
+              <w:left w:type="dxa" w:w="120"/>
+              <w:bottom w:type="dxa" w:w="80"/>
+              <w:right w:type="dxa" w:w="120"/>
+            </w:tcMar>
+          </w:tcPr>
+          <w:p>
+            <w:r>
+              <w:rPr>
+                <w:rFonts w:ascii="Arial" w:cs="Arial" w:eastAsia="Arial" w:hAnsi="Arial"/>
+                <w:b w:val="false"/>
+                <w:bCs w:val="false"/>
+                <w:color w:val="000000"/>
+                <w:sz w:val="20"/>
+                <w:szCs w:val="20"/>
+              </w:rPr>
+              <w:t xml:space="preserve">Paramount — Director of Accounting</w:t>
+            </w:r>
+          </w:p>
+        </w:tc>
+        <w:tc>
+          <w:tcPr>
+            <w:tcW w:type="dxa" w:w="4360"/>
+            <w:tcBorders>
+              <w:top w:val="single" w:color="BFBFBF" w:sz="4"/>
+              <w:left w:val="single" w:color="BFBFBF" w:sz="4"/>
+              <w:bottom w:val="single" w:color="BFBFBF" w:sz="4"/>
+              <w:right w:val="single" w:color="BFBFBF" w:sz="4"/>
+            </w:tcBorders>
+            <w:tcMar>
+              <w:top w:type="dxa" w:w="80"/>
+              <w:left w:type="dxa" w:w="120"/>
+              <w:bottom w:type="dxa" w:w="80"/>
+              <w:right w:type="dxa" w:w="120"/>
+            </w:tcMar>
+          </w:tcPr>
+          <w:p>
+            <w:r>
+              <w:rPr>
+                <w:rFonts w:ascii="Arial" w:cs="Arial" w:eastAsia="Arial" w:hAnsi="Arial"/>
+                <w:b w:val="false"/>
+                <w:bCs w:val="false"/>
+                <w:color w:val="000000"/>
+                <w:sz w:val="20"/>
+                <w:szCs w:val="20"/>
+              </w:rPr>
+              <w:t xml:space="preserve">Director of Accounting at Paramount. Reports into Controllership/Finance org. Email: Lena_Malkon@Paramount.com</w:t>
+            </w:r>
+          </w:p>
+        </w:tc>
+      </w:tr>
+      <w:tr>
+        <w:tc>
+          <w:tcPr>
+            <w:tcW w:type="dxa" w:w="1800"/>
+            <w:tcBorders>
+              <w:top w:val="single" w:color="BFBFBF" w:sz="4"/>
+              <w:left w:val="single" w:color="BFBFBF" w:sz="4"/>
+              <w:bottom w:val="single" w:color="BFBFBF" w:sz="4"/>
+              <w:right w:val="single" w:color="BFBFBF" w:sz="4"/>
+            </w:tcBorders>
+            <w:tcMar>
+              <w:top w:type="dxa" w:w="80"/>
+              <w:left w:type="dxa" w:w="120"/>
+              <w:bottom w:type="dxa" w:w="80"/>
+              <w:right w:type="dxa" w:w="120"/>
+            </w:tcMar>
+          </w:tcPr>
+          <w:p>
+            <w:r>
+              <w:rPr>
+                <w:rFonts w:ascii="Arial" w:cs="Arial" w:eastAsia="Arial" w:hAnsi="Arial"/>
+                <w:b w:val="false"/>
+                <w:bCs w:val="false"/>
+                <w:color w:val="000000"/>
+                <w:sz w:val="20"/>
+                <w:szCs w:val="20"/>
+              </w:rPr>
+              <w:t xml:space="preserve">Brooke Tilton-Foley</w:t>
+            </w:r>
+          </w:p>
+        </w:tc>
+        <w:tc>
+          <w:tcPr>
+            <w:tcW w:type="dxa" w:w="3200"/>
+            <w:tcBorders>
+              <w:top w:val="single" w:color="BFBFBF" w:sz="4"/>
+              <w:left w:val="single" w:color="BFBFBF" w:sz="4"/>
+              <w:bottom w:val="single" w:color="BFBFBF" w:sz="4"/>
+              <w:right w:val="single" w:color="BFBFBF" w:sz="4"/>
+            </w:tcBorders>
+            <w:tcMar>
+              <w:top w:type="dxa" w:w="80"/>
+              <w:left w:type="dxa" w:w="120"/>
+              <w:bottom w:type="dxa" w:w="80"/>
+              <w:right w:type="dxa" w:w="120"/>
+            </w:tcMar>
+          </w:tcPr>
+          <w:p>
+            <w:r>
+              <w:rPr>
+                <w:rFonts w:ascii="Arial" w:cs="Arial" w:eastAsia="Arial" w:hAnsi="Arial"/>
+                <w:b w:val="false"/>
+                <w:bCs w:val="false"/>
+                <w:color w:val="000000"/>
+                <w:sz w:val="20"/>
+                <w:szCs w:val="20"/>
+              </w:rPr>
+              <w:t xml:space="preserve">Paramount — Treasury Operations Leader | CTP</w:t>
+            </w:r>
+          </w:p>
+        </w:tc>
+        <w:tc>
+          <w:tcPr>
+            <w:tcW w:type="dxa" w:w="4360"/>
+            <w:tcBorders>
+              <w:top w:val="single" w:color="BFBFBF" w:sz="4"/>
+              <w:left w:val="single" w:color="BFBFBF" w:sz="4"/>
+              <w:bottom w:val="single" w:color="BFBFBF" w:sz="4"/>
+              <w:right w:val="single" w:color="BFBFBF" w:sz="4"/>
+            </w:tcBorders>
+            <w:tcMar>
+              <w:top w:type="dxa" w:w="80"/>
+              <w:left w:type="dxa" w:w="120"/>
+              <w:bottom w:type="dxa" w:w="80"/>
+              <w:right w:type="dxa" w:w="120"/>
+            </w:tcMar>
+          </w:tcPr>
+          <w:p>
+            <w:r>
+              <w:rPr>
+                <w:rFonts w:ascii="Arial" w:cs="Arial" w:eastAsia="Arial" w:hAnsi="Arial"/>
+                <w:b w:val="false"/>
+                <w:bCs w:val="false"/>
+                <w:color w:val="000000"/>
+                <w:sz w:val="20"/>
+                <w:szCs w:val="20"/>
+              </w:rPr>
+              <w:t xml:space="preserve">Treasury Operations Leader at Paramount. Specialises in Global Cash Management, Bank Relationship Management, and Technology Process Automation (CTP). Relevant for banking integrations, lockbox, and cash application touchpoints.</w:t>
             </w:r>
           </w:p>
         </w:tc>
@@ -13991,11 +14257,7 @@
 </w:document>
 </file>
 
-<file path=word/comments.xml><?xml version="1.0" encoding="utf-8"?>
-<w:comments xmlns:cx="http://schemas.microsoft.com/office/drawing/2014/chartex" xmlns:cx1="http://schemas.microsoft.com/office/drawing/2015/9/8/chartex" xmlns:cx2="http://schemas.microsoft.com/office/drawing/2015/10/21/chartex" xmlns:cx3="http://schemas.microsoft.com/office/drawing/2016/5/9/chartex" xmlns:cx4="http://schemas.microsoft.com/office/drawing/2016/5/10/chartex" xmlns:cx5="http://schemas.microsoft.com/office/drawing/2016/5/11/chartex" xmlns:cx6="http://schemas.microsoft.com/office/drawing/2016/5/12/chartex" xmlns:cx7="http://schemas.microsoft.com/office/drawing/2016/5/13/chartex" xmlns:cx8="http://schemas.microsoft.com/office/drawing/2016/5/14/chartex" xmlns:mc="http://schemas.openxmlformats.org/markup-compatibility/2006" xmlns:aink="http://schemas.microsoft.com/office/drawing/2016/ink" xmlns:am3d="http://schemas.microsoft.com/office/drawing/2017/model3d" xmlns:o="urn:schemas-microsoft-com:office:office" xmlns:r="http://schemas.openxmlformats.org/officeDocument/2006/relationships" xmlns:m="http://schemas.openxmlformats.org/officeDocument/2006/math" xmlns:v="urn:schemas-microsoft-com:vml" xmlns:wp14="http://schemas.microsoft.com/office/word/2010/wordprocessingDrawing" xmlns:wp="http://schemas.openxmlformats.org/drawingml/2006/wordprocessingDrawing" xmlns:w10="urn:schemas-microsoft-com:office:word" xmlns:w="http://schemas.openxmlformats.org/wordprocessingml/2006/main" xmlns:w14="http://schemas.microsoft.com/office/word/2010/wordml" xmlns:w15="http://schemas.microsoft.com/office/word/2012/wordml" xmlns:w16cex="http://schemas.microsoft.com/office/word/2018/wordml/cex" xmlns:w16cid="http://schemas.microsoft.com/office/word/2016/wordml/cid" xmlns:w16="http://schemas.microsoft.com/office/word/2018/wordml" xmlns:w16sdtdh="http://schemas.microsoft.com/office/word/2020/wordml/sdtdatahash" xmlns:w16se="http://schemas.microsoft.com/office/word/2015/wordml/symex" xmlns:wpg="http://schemas.microsoft.com/office/word/2010/wordprocessingGroup" xmlns:wpi="http://schemas.microsoft.com/office/word/2010/wordprocessingInk" xmlns:wne="http://schemas.microsoft.com/office/word/2006/wordml" xmlns:wps="http://schemas.microsoft.com/office/word/2010/wordprocessingShape"/>
-</file>
-
-<file path=word/endnotes.xml><?xml version="1.0" encoding="utf-8"?>
+<file path=word\endnotes.xml><?xml version="1.0" encoding="utf-8"?>
 <w:endnotes xmlns:wpc="http://schemas.microsoft.com/office/word/2010/wordprocessingCanvas" xmlns:mc="http://schemas.openxmlformats.org/markup-compatibility/2006" xmlns:o="urn:schemas-microsoft-com:office:office" xmlns:r="http://schemas.openxmlformats.org/officeDocument/2006/relationships" xmlns:m="http://schemas.openxmlformats.org/officeDocument/2006/math" xmlns:v="urn:schemas-microsoft-com:vml" xmlns:wp14="http://schemas.microsoft.com/office/word/2010/wordprocessingDrawing" xmlns:wp="http://schemas.openxmlformats.org/drawingml/2006/wordprocessingDrawing" xmlns:w10="urn:schemas-microsoft-com:office:word" xmlns:w="http://schemas.openxmlformats.org/wordprocessingml/2006/main" xmlns:w14="http://schemas.microsoft.com/office/word/2010/wordml" xmlns:w15="http://schemas.microsoft.com/office/word/2012/wordml" xmlns:wpg="http://schemas.microsoft.com/office/word/2010/wordprocessingGroup" xmlns:wpi="http://schemas.microsoft.com/office/word/2010/wordprocessingInk" xmlns:wne="http://schemas.microsoft.com/office/word/2006/wordml" xmlns:wps="http://schemas.microsoft.com/office/word/2010/wordprocessingShape" mc:Ignorable="w14 w15 wp14">
   <w:endnote w:type="separator" w:id="-1">
     <w:p>
@@ -14032,7 +14294,11 @@
 </w:endnotes>
 </file>
 
-<file path=word/footer1.xml><?xml version="1.0" encoding="utf-8"?>
+<file path=word\fontTable.xml><?xml version="1.0" encoding="utf-8"?>
+<w:fonts xmlns:mc="http://schemas.openxmlformats.org/markup-compatibility/2006" xmlns:r="http://schemas.openxmlformats.org/officeDocument/2006/relationships" xmlns:w="http://schemas.openxmlformats.org/wordprocessingml/2006/main" xmlns:w14="http://schemas.microsoft.com/office/word/2010/wordml" xmlns:w15="http://schemas.microsoft.com/office/word/2012/wordml" xmlns:w16cex="http://schemas.microsoft.com/office/word/2018/wordml/cex" xmlns:w16cid="http://schemas.microsoft.com/office/word/2016/wordml/cid" xmlns:w16="http://schemas.microsoft.com/office/word/2018/wordml" xmlns:w16sdtdh="http://schemas.microsoft.com/office/word/2020/wordml/sdtdatahash" xmlns:w16se="http://schemas.microsoft.com/office/word/2015/wordml/symex" mc:Ignorable="w14 w15 w16se w16cid w16 w16cex w16sdtdh"/>
+</file>
+
+<file path=word\footer1.xml><?xml version="1.0" encoding="utf-8"?>
 <w:ftr xmlns:wpc="http://schemas.microsoft.com/office/word/2010/wordprocessingCanvas" xmlns:mc="http://schemas.openxmlformats.org/markup-compatibility/2006" xmlns:o="urn:schemas-microsoft-com:office:office" xmlns:r="http://schemas.openxmlformats.org/officeDocument/2006/relationships" xmlns:m="http://schemas.openxmlformats.org/officeDocument/2006/math" xmlns:v="urn:schemas-microsoft-com:vml" xmlns:wp14="http://schemas.microsoft.com/office/word/2010/wordprocessingDrawing" xmlns:wp="http://schemas.openxmlformats.org/drawingml/2006/wordprocessingDrawing" xmlns:w10="urn:schemas-microsoft-com:office:word" xmlns:w="http://schemas.openxmlformats.org/wordprocessingml/2006/main" xmlns:w14="http://schemas.microsoft.com/office/word/2010/wordml" xmlns:w15="http://schemas.microsoft.com/office/word/2012/wordml" xmlns:wpg="http://schemas.microsoft.com/office/word/2010/wordprocessingGroup" xmlns:wpi="http://schemas.microsoft.com/office/word/2010/wordprocessingInk" xmlns:wne="http://schemas.microsoft.com/office/word/2006/wordml" xmlns:wps="http://schemas.microsoft.com/office/word/2010/wordprocessingShape">
   <w:p>
     <w:pPr>
@@ -14077,7 +14343,7 @@
 </w:ftr>
 </file>
 
-<file path=word/footnotes.xml><?xml version="1.0" encoding="utf-8"?>
+<file path=word\footnotes.xml><?xml version="1.0" encoding="utf-8"?>
 <w:footnotes xmlns:wpc="http://schemas.microsoft.com/office/word/2010/wordprocessingCanvas" xmlns:mc="http://schemas.openxmlformats.org/markup-compatibility/2006" xmlns:o="urn:schemas-microsoft-com:office:office" xmlns:r="http://schemas.openxmlformats.org/officeDocument/2006/relationships" xmlns:m="http://schemas.openxmlformats.org/officeDocument/2006/math" xmlns:v="urn:schemas-microsoft-com:vml" xmlns:wp14="http://schemas.microsoft.com/office/word/2010/wordprocessingDrawing" xmlns:wp="http://schemas.openxmlformats.org/drawingml/2006/wordprocessingDrawing" xmlns:w10="urn:schemas-microsoft-com:office:word" xmlns:w="http://schemas.openxmlformats.org/wordprocessingml/2006/main" xmlns:w14="http://schemas.microsoft.com/office/word/2010/wordml" xmlns:w15="http://schemas.microsoft.com/office/word/2012/wordml" xmlns:wpg="http://schemas.microsoft.com/office/word/2010/wordprocessingGroup" xmlns:wpi="http://schemas.microsoft.com/office/word/2010/wordprocessingInk" xmlns:wne="http://schemas.microsoft.com/office/word/2006/wordml" xmlns:wps="http://schemas.microsoft.com/office/word/2010/wordprocessingShape" mc:Ignorable="w14 w15 wp14">
   <w:footnote w:type="separator" w:id="-1">
     <w:p>
@@ -14114,7 +14380,7 @@
 </w:footnotes>
 </file>
 
-<file path=word/header1.xml><?xml version="1.0" encoding="utf-8"?>
+<file path=word\header1.xml><?xml version="1.0" encoding="utf-8"?>
 <w:hdr xmlns:wpc="http://schemas.microsoft.com/office/word/2010/wordprocessingCanvas" xmlns:mc="http://schemas.openxmlformats.org/markup-compatibility/2006" xmlns:o="urn:schemas-microsoft-com:office:office" xmlns:r="http://schemas.openxmlformats.org/officeDocument/2006/relationships" xmlns:m="http://schemas.openxmlformats.org/officeDocument/2006/math" xmlns:v="urn:schemas-microsoft-com:vml" xmlns:wp14="http://schemas.microsoft.com/office/word/2010/wordprocessingDrawing" xmlns:wp="http://schemas.openxmlformats.org/drawingml/2006/wordprocessingDrawing" xmlns:w10="urn:schemas-microsoft-com:office:word" xmlns:w="http://schemas.openxmlformats.org/wordprocessingml/2006/main" xmlns:w14="http://schemas.microsoft.com/office/word/2010/wordml" xmlns:w15="http://schemas.microsoft.com/office/word/2012/wordml" xmlns:wpg="http://schemas.microsoft.com/office/word/2010/wordprocessingGroup" xmlns:wpi="http://schemas.microsoft.com/office/word/2010/wordprocessingInk" xmlns:wne="http://schemas.microsoft.com/office/word/2006/wordml" xmlns:wps="http://schemas.microsoft.com/office/word/2010/wordprocessingShape" xmlns:cx="http://schemas.microsoft.com/office/drawing/2014/chartex" xmlns:cx1="http://schemas.microsoft.com/office/drawing/2015/9/8/chartex" xmlns:cx2="http://schemas.microsoft.com/office/drawing/2015/10/21/chartex" xmlns:cx3="http://schemas.microsoft.com/office/drawing/2016/5/9/chartex" xmlns:cx4="http://schemas.microsoft.com/office/drawing/2016/5/10/chartex" xmlns:cx5="http://schemas.microsoft.com/office/drawing/2016/5/11/chartex" xmlns:cx6="http://schemas.microsoft.com/office/drawing/2016/5/12/chartex" xmlns:cx7="http://schemas.microsoft.com/office/drawing/2016/5/13/chartex" xmlns:cx8="http://schemas.microsoft.com/office/drawing/2016/5/14/chartex" xmlns:w16cid="http://schemas.microsoft.com/office/word/2016/wordml/cid" xmlns:w16se="http://schemas.microsoft.com/office/word/2015/wordml/symex">
   <w:p>
     <w:pPr>
@@ -14147,7 +14413,7 @@
 </w:hdr>
 </file>
 
-<file path=word/numbering.xml><?xml version="1.0" encoding="utf-8"?>
+<file path=word\numbering.xml><?xml version="1.0" encoding="utf-8"?>
 <w:numbering xmlns:wpc="http://schemas.microsoft.com/office/word/2010/wordprocessingCanvas" xmlns:mc="http://schemas.openxmlformats.org/markup-compatibility/2006" xmlns:o="urn:schemas-microsoft-com:office:office" xmlns:r="http://schemas.openxmlformats.org/officeDocument/2006/relationships" xmlns:m="http://schemas.openxmlformats.org/officeDocument/2006/math" xmlns:v="urn:schemas-microsoft-com:vml" xmlns:wp14="http://schemas.microsoft.com/office/word/2010/wordprocessingDrawing" xmlns:wp="http://schemas.openxmlformats.org/drawingml/2006/wordprocessingDrawing" xmlns:w10="urn:schemas-microsoft-com:office:word" xmlns:w="http://schemas.openxmlformats.org/wordprocessingml/2006/main" xmlns:w14="http://schemas.microsoft.com/office/word/2010/wordml" xmlns:w15="http://schemas.microsoft.com/office/word/2012/wordml" xmlns:wpg="http://schemas.microsoft.com/office/word/2010/wordprocessingGroup" xmlns:wpi="http://schemas.microsoft.com/office/word/2010/wordprocessingInk" xmlns:wne="http://schemas.microsoft.com/office/word/2006/wordml" xmlns:wps="http://schemas.microsoft.com/office/word/2010/wordprocessingShape" mc:Ignorable="w14 w15 wp14">
   <w:abstractNum w:abstractNumId="1" w15:restartNumberingAfterBreak="0">
     <w:multiLevelType w:val="hybridMultilevel"/>
@@ -14242,7 +14508,17 @@
 </w:numbering>
 </file>
 
-<file path=word/styles.xml><?xml version="1.0" encoding="utf-8"?>
+<file path=word\settings.xml><?xml version="1.0" encoding="utf-8"?>
+<w:settings xmlns:wpc="http://schemas.microsoft.com/office/word/2010/wordprocessingCanvas" xmlns:mc="http://schemas.openxmlformats.org/markup-compatibility/2006" xmlns:o="urn:schemas-microsoft-com:office:office" xmlns:r="http://schemas.openxmlformats.org/officeDocument/2006/relationships" xmlns:m="http://schemas.openxmlformats.org/officeDocument/2006/math" xmlns:v="urn:schemas-microsoft-com:vml" xmlns:wp14="http://schemas.microsoft.com/office/word/2010/wordprocessingDrawing" xmlns:wp="http://schemas.openxmlformats.org/drawingml/2006/wordprocessingDrawing" xmlns:w10="urn:schemas-microsoft-com:office:word" xmlns:w="http://schemas.openxmlformats.org/wordprocessingml/2006/main" xmlns:w14="http://schemas.microsoft.com/office/word/2010/wordml" xmlns:w15="http://schemas.microsoft.com/office/word/2012/wordml" xmlns:wpg="http://schemas.microsoft.com/office/word/2010/wordprocessingGroup" xmlns:wpi="http://schemas.microsoft.com/office/word/2010/wordprocessingInk" xmlns:wne="http://schemas.microsoft.com/office/word/2006/wordml" xmlns:wps="http://schemas.microsoft.com/office/word/2010/wordprocessingShape" mc:Ignorable="w14 w15 wp14">
+  <w:displayBackgroundShape/>
+  <w:evenAndOddHeaders w:val="false"/>
+  <w:compat>
+    <w:compatSetting w:val="15" w:name="compatibilityMode" w:uri="http://schemas.microsoft.com/office/word"/>
+  </w:compat>
+</w:settings>
+</file>
+
+<file path=word\styles.xml><?xml version="1.0" encoding="utf-8"?>
 <w:styles xmlns:mc="http://schemas.openxmlformats.org/markup-compatibility/2006" xmlns:r="http://schemas.openxmlformats.org/officeDocument/2006/relationships" xmlns:w="http://schemas.openxmlformats.org/wordprocessingml/2006/main" xmlns:w14="http://schemas.microsoft.com/office/word/2010/wordml" xmlns:w15="http://schemas.microsoft.com/office/word/2012/wordml" mc:Ignorable="w14 w15">
   <w:docDefaults>
     <w:rPrDefault>

</xml_diff>